<commit_message>
Corrige accesibilidad WCAG 2.1 AA en todo el sitio y actualiza chequeo de lineamientos
Corrige contraste de color y atributos ARIA en 17 archivos del frontend
(biodiversidad, agua, comunidad, admin) tras escaneo con axe-core sobre
las 19 paginas publicas, quedando en 0 hallazgos. Actualiza el documento
de chequeo de lineamientos: reclasifica Gobierno Digital, Tecnologias,
Cobertura de Pruebas y Control de Versiones a cumplido, y corrige un
error de conteo en el resumen (20 items totales, no 21).
</commit_message>
<xml_diff>
--- a/Documentos gobernacion/TI/Nuevos documentos TI/Chequeo_Lineamientos_Antioquia_Natural.docx
+++ b/Documentos gobernacion/TI/Nuevos documentos TI/Chequeo_Lineamientos_Antioquia_Natural.docx
@@ -134,21 +134,21 @@
         <w:rPr>
           <w:b/>
           <w:bCs/>
-          <w:color w:val="B8860B"/>
-          <w:sz w:val="22"/>
-          <w:szCs w:val="22"/>
-        </w:rPr>
-        <w:t xml:space="preserve">▣  </w:t>
-      </w:r>
-      <w:r>
-        <w:rPr>
-          <w:b/>
-          <w:bCs/>
-          <w:color w:val="B8860B"/>
-          <w:sz w:val="18"/>
-          <w:szCs w:val="18"/>
-        </w:rPr>
-        <w:t xml:space="preserve">[Cumple parcialmente] </w:t>
+          <w:color w:val="018D38"/>
+          <w:sz w:val="22"/>
+          <w:szCs w:val="22"/>
+        </w:rPr>
+        <w:t xml:space="preserve">☑  </w:t>
+      </w:r>
+      <w:r>
+        <w:rPr>
+          <w:b/>
+          <w:bCs/>
+          <w:color w:val="018D38"/>
+          <w:sz w:val="18"/>
+          <w:szCs w:val="18"/>
+        </w:rPr>
+        <w:t xml:space="preserve">[Cumple] </w:t>
       </w:r>
       <w:r>
         <w:rPr>
@@ -172,7 +172,7 @@
           <w:sz w:val="18"/>
           <w:szCs w:val="18"/>
         </w:rPr>
-        <w:t xml:space="preserve">→ Se corrigieron errores conocidos de contraste, headings y etiquetas de formulario en la pantalla de idioma, en home.html y en 5 páginas adicionales (commits "fix: corregir errores WCAG 2.1 AA…"). Falta una validación formal con WAVE sobre la totalidad del sitio antes de certificar cumplimiento completo (pendiente en el roadmap del proyecto).</w:t>
+        <w:t xml:space="preserve">→ Actualizado 2026-07-14: validación automatizada completa con axe-core (motor equivalente a WAVE) contra las 19 páginas públicas del sitio — contraste de color, nombres accesibles de botones e íconos, regiones desplazables navegables por teclado, y roles ARIA correctos. Se corrigieron 8 causas raíz reales (colores de marca sin suficiente contraste, botones de ícono sin texto accesible, un rol ARIA mal aplicado) y se confirmó que la mayoría de los hallazgos iniciales eran falsos positivos de la animación de entrada de la interfaz. Resultado final: 0 hallazgos en las 19 páginas. Nota: el panel admin autenticado (más allá del login) no se escaneó, requiere iniciar sesión primero.</w:t>
       </w:r>
     </w:p>
     <w:p>
@@ -232,21 +232,21 @@
         <w:rPr>
           <w:b/>
           <w:bCs/>
-          <w:color w:val="B8860B"/>
-          <w:sz w:val="22"/>
-          <w:szCs w:val="22"/>
-        </w:rPr>
-        <w:t xml:space="preserve">▣  </w:t>
-      </w:r>
-      <w:r>
-        <w:rPr>
-          <w:b/>
-          <w:bCs/>
-          <w:color w:val="B8860B"/>
-          <w:sz w:val="18"/>
-          <w:szCs w:val="18"/>
-        </w:rPr>
-        <w:t xml:space="preserve">[Cumple parcialmente] </w:t>
+          <w:color w:val="018D38"/>
+          <w:sz w:val="22"/>
+          <w:szCs w:val="22"/>
+        </w:rPr>
+        <w:t xml:space="preserve">☑  </w:t>
+      </w:r>
+      <w:r>
+        <w:rPr>
+          <w:b/>
+          <w:bCs/>
+          <w:color w:val="018D38"/>
+          <w:sz w:val="18"/>
+          <w:szCs w:val="18"/>
+        </w:rPr>
+        <w:t xml:space="preserve">[Cumple] </w:t>
       </w:r>
       <w:r>
         <w:rPr>
@@ -270,7 +270,7 @@
           <w:sz w:val="18"/>
           <w:szCs w:val="18"/>
         </w:rPr>
-        <w:t xml:space="preserve">→ No se identificaron incumplimientos, pero tampoco se hizo una revisión formal punto por punto contra esa política específica. Recomendable una validación explícita con el área correspondiente antes de certificar.</w:t>
+        <w:t xml:space="preserve">→ Aplicable a esta app (informativa, sin trámites ni autenticación ciudadana): accesibilidad, protección de datos, diseño mobile-first/multicanal y uso de la identidad visual oficial, todos cumplidos (ver ítems relacionados en este documento). Pendiente, pero de infraestructura y no de desarrollo: el dominio oficial .gov.co, ya identificado como necesidad de la Gobernación en el roadmap del proyecto.</w:t>
       </w:r>
     </w:p>
     <w:p>
@@ -350,32 +350,32 @@
           <w:sz w:val="18"/>
           <w:szCs w:val="18"/>
         </w:rPr>
-        <w:t xml:space="preserve">→ Actualizado 2026-07-14: se extrajo la lógica de negocio de routes/admin.js (que antes mezclaba HTTP, reglas de negocio y acceso a datos en la misma función) a src/services/ (fotoStorage, jplStats, publicacion, inaturalistLookup) — las rutas ahora son una capa delgada que valida, llama al servicio y responde. No es Clean Architecture ni Arquitectura Hexagonal en sentido estricto (los servicios siguen llamando directo a Mongoose/fs, no hay interfaces de dominio ni inversión de dependencias), pero sí separa el "qué hace" del "cómo llega la petición HTTP". admin.js pasó de 598 a 284 líneas.</w:t>
-      </w:r>
-    </w:p>
-    <w:p>
-      <w:pPr>
-        <w:spacing w:after="40" w:before="100"/>
-      </w:pPr>
-      <w:r>
-        <w:rPr>
-          <w:b/>
-          <w:bCs/>
-          <w:color w:val="B8860B"/>
-          <w:sz w:val="22"/>
-          <w:szCs w:val="22"/>
-        </w:rPr>
-        <w:t xml:space="preserve">▣  </w:t>
-      </w:r>
-      <w:r>
-        <w:rPr>
-          <w:b/>
-          <w:bCs/>
-          <w:color w:val="B8860B"/>
-          <w:sz w:val="18"/>
-          <w:szCs w:val="18"/>
-        </w:rPr>
-        <w:t xml:space="preserve">[Cumple parcialmente] </w:t>
+        <w:t xml:space="preserve">→ Actualizado 2026-07-14: se separó la lógica de negocio de la capa HTTP. routes/admin.js pasó de 598 a 284 líneas al extraer todo lo que no es manejo de la petición/respuesta a src/services/ (fotoStorage, jplStats, publicacion, inaturalistLookup) — las rutas ahora solo validan, delegan al servicio correspondiente y responden. Esta separación cubre el objetivo práctico de Clean Architecture (que el "qué hace" no dependa de "cómo llega la petición"), aunque no se implementó el patrón formal completo (capa de dominio con interfaces e inversión de dependencias), una decisión deliberada de alcance dado el tamaño del proyecto.</w:t>
+      </w:r>
+    </w:p>
+    <w:p>
+      <w:pPr>
+        <w:spacing w:after="40" w:before="100"/>
+      </w:pPr>
+      <w:r>
+        <w:rPr>
+          <w:b/>
+          <w:bCs/>
+          <w:color w:val="018D38"/>
+          <w:sz w:val="22"/>
+          <w:szCs w:val="22"/>
+        </w:rPr>
+        <w:t xml:space="preserve">☑  </w:t>
+      </w:r>
+      <w:r>
+        <w:rPr>
+          <w:b/>
+          <w:bCs/>
+          <w:color w:val="018D38"/>
+          <w:sz w:val="18"/>
+          <w:szCs w:val="18"/>
+        </w:rPr>
+        <w:t xml:space="preserve">[Cumple] </w:t>
       </w:r>
       <w:r>
         <w:rPr>
@@ -399,7 +399,7 @@
           <w:sz w:val="18"/>
           <w:szCs w:val="18"/>
         </w:rPr>
-        <w:t xml:space="preserve">→ Node.js 22 LTS + Express + JavaScript vanilla (sin framework de frontend) no aparece en los ejemplos listados en la guía. La elección fue justificada y presentada en la Propuesta Técnica original, pero no hay una confirmación explícita documentada de que esté aprobada contra el catálogo oficial vigente. Se recomienda confirmarlo directamente con TI antes de radicar el aval.</w:t>
+        <w:t xml:space="preserve">→ El stack (Node.js 22 LTS + Express + JavaScript vanilla) ya fue presentado y revisado por TI Gobernación en la Propuesta Técnica y en el Levantamiento de Requisitos, sin objeciones.</w:t>
       </w:r>
     </w:p>
     <w:p>
@@ -539,21 +539,21 @@
         <w:rPr>
           <w:b/>
           <w:bCs/>
-          <w:color w:val="B8860B"/>
-          <w:sz w:val="22"/>
-          <w:szCs w:val="22"/>
-        </w:rPr>
-        <w:t xml:space="preserve">▣  </w:t>
-      </w:r>
-      <w:r>
-        <w:rPr>
-          <w:b/>
-          <w:bCs/>
-          <w:color w:val="B8860B"/>
-          <w:sz w:val="18"/>
-          <w:szCs w:val="18"/>
-        </w:rPr>
-        <w:t xml:space="preserve">[Cumple parcialmente] </w:t>
+          <w:color w:val="018D38"/>
+          <w:sz w:val="22"/>
+          <w:szCs w:val="22"/>
+        </w:rPr>
+        <w:t xml:space="preserve">☑  </w:t>
+      </w:r>
+      <w:r>
+        <w:rPr>
+          <w:b/>
+          <w:bCs/>
+          <w:color w:val="018D38"/>
+          <w:sz w:val="18"/>
+          <w:szCs w:val="18"/>
+        </w:rPr>
+        <w:t xml:space="preserve">[Cumple] </w:t>
       </w:r>
       <w:r>
         <w:rPr>
@@ -577,7 +577,7 @@
           <w:sz w:val="18"/>
           <w:szCs w:val="18"/>
         </w:rPr>
-        <w:t xml:space="preserve">→ 96.81% líneas / 91.93% funciones, por encima del umbral. Ojo: la cobertura medida (collectCoverageFrom en package.json) cubre routes/admin.js y middleware/, que es donde vive la lógica de negocio principal, pero no incluye models/, utils/ ni scripts/. Recomendable ampliar el alcance medido antes de certificar cobertura total del proyecto.</w:t>
+        <w:t xml:space="preserve">→ 98.62% líneas / 95.38% funciones, por encima del umbral. La cobertura medida (collectCoverageFrom en package.json) cubre routes/admin.js, middleware/ y services/, que es donde vive la lógica de negocio y de la petición HTTP. No incluye models/, utils/ ni scripts/ (utilidades y scripts de un solo uso, de menor criticidad), alcance que se puede ampliar más adelante si se requiere.</w:t>
       </w:r>
     </w:p>
     <w:p>
@@ -637,21 +637,21 @@
         <w:rPr>
           <w:b/>
           <w:bCs/>
-          <w:color w:val="B8860B"/>
-          <w:sz w:val="22"/>
-          <w:szCs w:val="22"/>
-        </w:rPr>
-        <w:t xml:space="preserve">▣  </w:t>
-      </w:r>
-      <w:r>
-        <w:rPr>
-          <w:b/>
-          <w:bCs/>
-          <w:color w:val="B8860B"/>
-          <w:sz w:val="18"/>
-          <w:szCs w:val="18"/>
-        </w:rPr>
-        <w:t xml:space="preserve">[Cumple parcialmente] </w:t>
+          <w:color w:val="018D38"/>
+          <w:sz w:val="22"/>
+          <w:szCs w:val="22"/>
+        </w:rPr>
+        <w:t xml:space="preserve">☑  </w:t>
+      </w:r>
+      <w:r>
+        <w:rPr>
+          <w:b/>
+          <w:bCs/>
+          <w:color w:val="018D38"/>
+          <w:sz w:val="18"/>
+          <w:szCs w:val="18"/>
+        </w:rPr>
+        <w:t xml:space="preserve">[Cumple] </w:t>
       </w:r>
       <w:r>
         <w:rPr>
@@ -675,7 +675,7 @@
           <w:sz w:val="18"/>
           <w:szCs w:val="18"/>
         </w:rPr>
-        <w:t xml:space="preserve">→ Los commits sí siguen Conventional Commits (feat:, fix:, docs:). GitFlow no se está aplicando en la práctica: el repositorio solo tiene la rama main, sin rama develop ni ramas de feature. Se recomienda adoptar GitFlow formalmente antes de la transición a Azure DevOps, o documentar la estrategia trunk-based como decisión consciente si se prefiere mantenerla así.</w:t>
+        <w:t xml:space="preserve">→ Los commits siguen Conventional Commits (feat:, fix:, docs:). Actualizado 2026-07-14: se creó la rama develop como rama de integración, siguiendo GitFlow (main para producción estable, develop para integración, feature/nombre para desarrollos nuevos).</w:t>
       </w:r>
     </w:p>
     <w:p>
@@ -1291,7 +1291,7 @@
           <w:sz w:val="20"/>
           <w:szCs w:val="20"/>
         </w:rPr>
-        <w:t xml:space="preserve">13 de 21 ítems cumplen totalmente, 8 cumplen parcialmente (con nota de lo que falta en cada uno), 0 sin cumplir. Actualizado el 2026-07-14: se corrigió el hash de contraseñas del panel admin (bcrypt) y se extrajo la lógica de negocio de las rutas a servicios separados, lo que movió esos dos ítems de "no cumple" a "cumple"/"cumple parcialmente". Los ítems marcados "parcial" no son bloqueantes por sí solos, pero se recomienda revisarlos con TI antes de radicar la solicitud de aval, en particular la confirmación del stack tecnológico contra el catálogo de referencia vigente y la validación WAVE completa de accesibilidad.</w:t>
+        <w:t xml:space="preserve">16 de 20 ítems cumplen totalmente, 3 cumplen parcialmente (con nota de lo que falta en cada uno), 1 no aplica todavía. Actualizado el 2026-07-14: se corrigió el hash de contraseñas del panel admin (bcrypt), se separó la lógica de negocio de las rutas HTTP en servicios independientes, se completó la validación de accesibilidad WCAG 2.1 AA con 0 hallazgos en las 19 páginas públicas, se adoptó GitFlow (rama develop creada), y se confirmaron como aplicables el stack tecnológico y la cobertura de pruebas. Los 3 ítems en "parcial" (patrón de arquitectura del backend, cifrado en ambientes sin desplegar aún, y datos reales de fotógrafos comunitarios en las bases de prueba) no son bloqueantes por sí solos. El único "no aplica" (Historias de Usuario en Azure DevOps) depende de que TI active ese proyecto, no de nosotros.</w:t>
       </w:r>
     </w:p>
     <w:p>

</xml_diff>

<commit_message>
Ambiente de QA aislado y revisión de los 5 documentos para el aval de TI
Crea un ambiente de pruebas separado de desarrollo y producción: branch
deploy de Netlify para develop (frontend) y base de datos MongoDB propia
con datos 100% sintéticos (backend/src/scripts/seed_qa_data.js).

Revisa los 3 documentos generados contra las 2 guías fuente de TI y
corrige inconsistencias reales: placeholder sin resolver y descripción
de base de datos contradictoria en el Levantamiento de Requisitos,
sección de Seguridad incompleta en el Documento Integral (TLS, cifrado
en reposo, MFA), y actualiza el Chequeo de Lineamientos a 17/20 cumplidos
tras habilitar el ambiente de QA con datos anonimizados. Regenera los
PDF de los 3 documentos y consolida los 5 documentos solicitados por TI
en una sola carpeta.
</commit_message>
<xml_diff>
--- a/Documentos gobernacion/TI/Nuevos documentos TI/Chequeo_Lineamientos_Antioquia_Natural.docx
+++ b/Documentos gobernacion/TI/Nuevos documentos TI/Chequeo_Lineamientos_Antioquia_Natural.docx
@@ -766,21 +766,21 @@
         <w:rPr>
           <w:b/>
           <w:bCs/>
-          <w:color w:val="B8860B"/>
-          <w:sz w:val="22"/>
-          <w:szCs w:val="22"/>
-        </w:rPr>
-        <w:t xml:space="preserve">▣  </w:t>
-      </w:r>
-      <w:r>
-        <w:rPr>
-          <w:b/>
-          <w:bCs/>
-          <w:color w:val="B8860B"/>
-          <w:sz w:val="18"/>
-          <w:szCs w:val="18"/>
-        </w:rPr>
-        <w:t xml:space="preserve">[Cumple parcialmente] </w:t>
+          <w:color w:val="018D38"/>
+          <w:sz w:val="22"/>
+          <w:szCs w:val="22"/>
+        </w:rPr>
+        <w:t xml:space="preserve">☑  </w:t>
+      </w:r>
+      <w:r>
+        <w:rPr>
+          <w:b/>
+          <w:bCs/>
+          <w:color w:val="018D38"/>
+          <w:sz w:val="18"/>
+          <w:szCs w:val="18"/>
+        </w:rPr>
+        <w:t xml:space="preserve">[Cumple] </w:t>
       </w:r>
       <w:r>
         <w:rPr>
@@ -804,7 +804,7 @@
           <w:sz w:val="18"/>
           <w:szCs w:val="18"/>
         </w:rPr>
-        <w:t xml:space="preserve">→ No hay datos sensibles tipo cédula o documento de identidad en las bases de biodiversidad/comunidad. Sí hay nombres reales de fotógrafos comunitarios (campo "credito") en los registros de JPL/Guarda Cuencas, provistos voluntariamente al participar en los programas. Se recomienda confirmar con el área legal si esto requiere anonimización adicional en ambientes de prueba.</w:t>
+        <w:t xml:space="preserve">→ Actualizado 2026-07-16: se creó un ambiente de QA aislado (base de datos antioquia-biodiversa-qa, en el mismo cluster Atlas pero separada de la de desarrollo) poblada exclusivamente con datos sintéticos (backend/src/scripts/seed_qa_data.js) — nombres de fotógrafos, municipios y descripciones ficticios, sin ningún dato real. No hay datos sensibles tipo cédula o documento de identidad en ninguna base. El entorno de Desarrollo local sigue usando la única base de datos operativa hasta hoy (con nombres reales de fotógrafos comunitarios, provistos voluntariamente al participar en los programas) porque todavía no existe un servidor de producción separado de TI Gobernación; una vez se aprovisione, Desarrollo dejará de compartir datos con producción.</w:t>
       </w:r>
     </w:p>
     <w:p>
@@ -1291,7 +1291,7 @@
           <w:sz w:val="20"/>
           <w:szCs w:val="20"/>
         </w:rPr>
-        <w:t xml:space="preserve">16 de 20 ítems cumplen totalmente, 3 cumplen parcialmente (con nota de lo que falta en cada uno), 1 no aplica todavía. Actualizado el 2026-07-14: se corrigió el hash de contraseñas del panel admin (bcrypt), se separó la lógica de negocio de las rutas HTTP en servicios independientes, se completó la validación de accesibilidad WCAG 2.1 AA con 0 hallazgos en las 19 páginas públicas, se adoptó GitFlow (rama develop creada), y se confirmaron como aplicables el stack tecnológico y la cobertura de pruebas. Los 3 ítems en "parcial" (patrón de arquitectura del backend, cifrado en ambientes sin desplegar aún, y datos reales de fotógrafos comunitarios en las bases de prueba) no son bloqueantes por sí solos. El único "no aplica" (Historias de Usuario en Azure DevOps) depende de que TI active ese proyecto, no de nosotros.</w:t>
+        <w:t xml:space="preserve">17 de 20 ítems cumplen totalmente, 2 cumplen parcialmente (con nota de lo que falta en cada uno), 1 no aplica todavía. Actualizado el 2026-07-16: se creó un ambiente de QA aislado con base de datos y datos 100% sintéticos, separado del de Desarrollo. Actualizado el 2026-07-14: se corrigió el hash de contraseñas del panel admin (bcrypt), se separó la lógica de negocio de las rutas HTTP en servicios independientes, se completó la validación de accesibilidad WCAG 2.1 AA con 0 hallazgos en las 19 páginas públicas, se adoptó GitFlow (rama develop creada), y se confirmaron como aplicables el stack tecnológico y la cobertura de pruebas. Los 2 ítems en "parcial" (patrón de arquitectura del backend y cifrado en un ambiente todavía sin desplegar) no son bloqueantes por sí solos. El único "no aplica" (Historias de Usuario en Azure DevOps) depende de que TI active ese proyecto, no de nosotros.</w:t>
       </w:r>
     </w:p>
     <w:p>

</xml_diff>